<commit_message>
1Corinthians 감사: 이슈 9건 수정 + 메타 20건 + Docs 재업로드 (16/16)
</commit_message>
<xml_diff>
--- a/gdocs_build/1Corinthians.docx
+++ b/gdocs_build/1Corinthians.docx
@@ -842,7 +842,7 @@
               <w:rPr>
                 <w:sz w:val="18"/>
               </w:rPr>
-              <w:t>While some people clamor for flashy miracles and others go for deep philosophy, we just keep proclaiming Christ, the crucified one. Some treat this like an anti-miracle, and others write it off as absurd. But to us, who are personally called by God himself — Jews and Greeks alike — Christ is God's ultimate miracle and wisdom, all wrapped up in one. Human wisdom is so cheap and powerless next to the seeming absurdity of God, and human strength can't even begin to compete with God's "weakness."</w:t>
+              <w:t>While the Jews clamor for flashy miracles and the Greeks go for deep philosophy, we just keep proclaiming Christ, the crucified one. Some treat this like an anti-miracle, and others write it off as absurd. But to us, who are personally called by God himself — Jews and Greeks alike — Christ is God's ultimate miracle and wisdom, all wrapped up in one. Human wisdom is so cheap and powerless next to the seeming absurdity of God, and human strength can't even begin to compete with God's "weakness."</w:t>
             </w:r>
           </w:p>
         </w:tc>
@@ -1209,7 +1209,7 @@
               <w:rPr>
                 <w:sz w:val="18"/>
               </w:rPr>
-              <w:t>Once you're solid in your faith, we've got some next-level wisdom to share. This isn't the popular stuff you hear from so-called experts that's trending one day and out of style the next. God's wisdom is mysterious and goes deep into the interior of his purposes — you don't find it lying around on the surface. It's not the latest message; it's more like the oldest: what God determined, long before we ever arrived on the scene, as the way to bring out his best in us. The so-called experts of our time? They were clueless. If they had any idea, they wouldn't have killed the Master of the God-designed life. It's like the old-school verse says: 'No one has ever seen, heard, or even imagined the awesome stuff God has lined up for those who love him.' But you guys? You get the inside scoop because God's Spirit brings it all out into the open before you.</w:t>
+              <w:t>Once you're solid in your faith, we've got some next-level wisdom to share. This isn't the popular stuff you hear from so-called experts that's trending one day and out of style the next. God's wisdom is mysterious and goes deep into the interior of his purposes — you don't find it lying around on the surface. It's not the latest message; it's more like the oldest: what God determined, long before we ever arrived on the scene, as the way to bring out his best in us. The so-called experts of our time? They were clueless. If they had any idea, they wouldn't have killed the Master of the God-designed life on a cross. It's like the old-school verse says: 'No one has ever seen, heard, or even imagined the awesome stuff God has lined up for those who love him.' But you guys? You get the inside scoop because God's Spirit brings it all out into the open before you.</w:t>
             </w:r>
           </w:p>
         </w:tc>
@@ -1351,7 +1351,7 @@
               <w:rPr>
                 <w:sz w:val="18"/>
               </w:rPr>
-              <w:t>Someone who's not on a spiritual level just can't get what God's Spirit is offering. It all sounds like nonsense to them — there's no capacity for it. You can only understand spiritual things with the Spirit: God's Spirit and our spirits in open communion. When you're spiritually alive, you have an all-access pass to everything God is doing, and you can't be judged by the haters. Remember that old question, 'Who can possibly know what God is thinking or doing?' Well, we've got the answer: Christ knows, and we have his Spirit. So we're in on the secret.</w:t>
+              <w:t>Someone who's not on a spiritual level just can't get what God's Spirit is offering. It all sounds like nonsense to them — there's no capacity for it. You can only understand spiritual things with the Spirit: God's Spirit and our spirits in open communion. When you're spiritually alive, you have an all-access pass to everything God is doing, and you can't be judged by the haters. Remember Isaiah's old question, 'Who can possibly know what God is thinking or doing?' Well, we've got the answer: Christ knows, and we have his Spirit. So we're in on the secret.</w:t>
             </w:r>
           </w:p>
         </w:tc>
@@ -5740,7 +5740,7 @@
               <w:rPr>
                 <w:sz w:val="18"/>
               </w:rPr>
-              <w:t>내가 지금 화가 나서 이러는 게 아님. 이거 성경 율법에도 다 나와 있는 내용임. 모세가 그랬거든, '곡식 터는 소한테 입마개 씌워서 일 못하게 하지 마라'고. 이게 진짜 소 걱정해서 한 말이겠냐? 당연히 우리한테도 해당되는 말이지. 농부가 밭 갈고 타작하는 건 다 추수할 때 거둘 게 있으니까 하는 거 아님? 우리가 너네한테 영적인 씨앗을 뿌렸는데, 밥 한두 끼 얻어먹는 게 그렇게 지나친 거냐? 다른 사람들은 너네한테 별거 다 요구하더만. 그럼 한 번도 요구한 적 없는 우리는 더 당당하게 요구할 수 있는 거 아님?</w:t>
+              <w:t>내가 지금 화가 나서 이러는 게 아님. 이거 성경 율법에도 다 나와 있는 내용임. 모세가 그랬거든, '곡식 타작하는 소가 곡식을 먹지 못하게 입마개를 씌우지 마라'고. 이게 진짜 소 걱정해서 한 말이겠냐? 당연히 우리한테도 해당되는 말이지. 농부가 밭 갈고 타작하는 건 다 추수할 때 거둘 게 있으니까 하는 거 아님? 우리가 너네한테 영적인 씨앗을 뿌렸는데, 밥 한두 끼 얻어먹는 게 그렇게 지나친 거냐? 다른 사람들은 너네한테 별거 다 요구하더만. 그럼 한 번도 요구한 적 없는 우리는 더 당당하게 요구할 수 있는 거 아님?</w:t>
             </w:r>
           </w:p>
         </w:tc>
@@ -8699,7 +8699,7 @@
               <w:rPr>
                 <w:sz w:val="18"/>
               </w:rPr>
-              <w:t>내가 아무리 말을 대단게 잘하고, 막 천사처럼 황홀한 목소리를 가졌어도, 사랑이 없으면 그냥 녹슨 문 삐걱거리는 소리랑 다를 게 없음. 완전 시끄럽기만 한 거지.</w:t>
+              <w:t>내가 아무리 말을 대단하게 잘하고, 막 천사처럼 황홀한 목소리를 가졌어도, 사랑이 없으면 그냥 녹슨 문 삐걱거리는 소리랑 다를 게 없음. 완전 시끄럽기만 한 거지.</w:t>
             </w:r>
           </w:p>
         </w:tc>
@@ -9618,7 +9618,7 @@
               <w:rPr>
                 <w:sz w:val="18"/>
               </w:rPr>
-              <w:t>자기만 아는 기도 언어로 기도할 때는, 그 경험 혼자만 간직하지 마셈. 다른 사람들도 그런 관계로 이끌어줄 수 있는 센스랑 능력을 구하셈. 내가 방언으로 기도하면 내 영혼은 기도하겠지만, 내 이성은 그냥 놀고 있을 거고, 머리도 그만큼 나빠질 거임. 그럼 해결책이 뭐겠냐? 답은 완전 간단함. 둘 다 하셈. 나 같으면 영적으로는 자유롭고 풍성하게 기도하면서, 머리로는 찬양하겠음. 너네가 아무도 못 알아듣는 기도 언어로 축복하면, 교회에 막 들어와서 뭔지 모르는 사람은 언제 "아멘" 해야 할지 모를 거 아님. 너네 축복 기도는 완전 놀라운 거겠지만, 그 사람은 그냥 무시당한 거나 마찬가지임.</w:t>
+              <w:t>자기만 아는 기도 언어로 기도할 때는, 그 경험 혼자만 간직하지 마셈. 다른 사람들도 그런 관계로 이끌어줄 수 있는 센스랑 능력을 구하셈. 내가 방언으로 기도하면 내 영혼은 기도하겠지만, 내 이성은 그냥 놀고 있을 거고, 그 많은 지능이 낭비되는 거임. 그럼 해결책이 뭐겠냐? 답은 완전 간단함. 둘 다 하셈. 나 같으면 영적으로는 자유롭고 풍성하게 기도하면서, 머리로는 찬양하겠음. 너네가 아무도 못 알아듣는 기도 언어로 축복하면, 교회에 막 들어와서 뭔지 모르는 사람은 언제 "아멘" 해야 할지 모를 거 아님. 너네 축복 기도는 완전 놀라운 거겠지만, 그 사람은 그냥 무시당한 거나 마찬가지임.</w:t>
             </w:r>
           </w:p>
         </w:tc>
@@ -9776,7 +9776,7 @@
               <w:rPr>
                 <w:sz w:val="18"/>
               </w:rPr>
-              <w:t>솔직히 말하면, 너네가 애처럼 생각하는 거에 좀 짜증남. 언제쯤 커서 어른스럽게 생각할래? 애처럼 악에 대해서는 잘 몰라도 됨. 그럴 땐 그냥 "안돼"라고 말할 줄 알면 됨. 근데 뭔가에 "예"라고 말하려면 그거 이상이 필요함. 성숙하고 잘 훈련된 머리만이 너네가 사기 안 당하게 지켜줄 수 있음. 하나님이 성경에 이렇게 말씀하셨음. "내가 낯선 방언과 낯선 사람의 입술로 이 백성에게 전해도 그들은 귀 기울여 듣지도 않고 믿지도 않을 것이다." 그러니 아무도 못 알아듣는 방언으로 말하는 게 뭔 소용이겠음? 그건 믿는 사람들한테 도움이 안 되고, 안 믿는 사람들한테는 구경거리가 돼서 그냥 멍하게 쳐다보게만 할 뿐임. 근데 알아듣기 쉬운 말로 진리를 말하면, 믿는 사람들 마음에도 바로 와닿고, 안 믿는 사람들한테도 거슬리지 않음. 너네가 교회에 모여 있고 안 믿는 사람들도 들어와 있는데, 마침 너네가 알아들을 수 없는 방언으로 기도하고 있다면, 걔네가 듣다가 너네 대단하다고 생각하고 바로 튀어나가지 않겠냐? 근데 안 믿는 사람들 몇 명이 우연히 교회에 들어왔는데, 너네가 하나님의 진리를 알아듣기 쉽게 똑바로 말하고 있다면, 걔네가 너네 말을 듣다가 진리를 깨닫고 자기 마음을 돌아보게 될 거임. 어느새 걔네는 하나님 앞에 엎드려서 하나님이 너네 가운데 계시다는 걸 인정하게 될 거임.</w:t>
+              <w:t>솔직히 말하면, 너네가 애처럼 생각하는 거에 좀 짜증남. 언제쯤 커서 어른스럽게 생각할래? 애처럼 악에 대해서는 잘 몰라도 됨. 그럴 땐 그냥 "안돼"라고 말할 줄 알면 됨. 근데 뭔가에 "예"라고 말하려면 그거 이상이 필요함. 성숙하고 잘 훈련된 머리만이 너네가 사기 안 당하게 지켜줄 수 있음. 하나님이 성경에 이렇게 말씀하셨음. "내가 낯선 방언과 낯선 사람의 입술로 이 백성에게 전해도 그들은 귀 기울여 듣지도 않고 믿지도 않을 것이다." 그러니 아무도 못 알아듣는 방언으로 말하는 게 뭔 소용이겠음? 그건 믿는 사람들한테 도움이 안 되고, 안 믿는 사람들한테는 구경거리가 돼서 그냥 멍하게 쳐다보게만 할 뿐임. 근데 알아듣기 쉬운 말로 진리를 말하면, 믿는 사람들 마음에도 바로 와닿고, 안 믿는 사람들한테도 거슬리지 않음. 너네가 교회에 모여 있고 안 믿는 사람들도 들어와 있는데, 마침 너네가 알아들을 수 없는 방언으로 기도하고 있다면, 걔네가 듣다가 너네가 정신이 나갔다고 생각하고 바로 튀어나가지 않겠냐? 근데 안 믿는 사람들 몇 명이 우연히 교회에 들어왔는데, 너네가 하나님의 진리를 알아듣기 쉽게 똑바로 말하고 있다면, 걔네가 너네 말을 듣다가 진리를 깨닫고 자기 마음을 돌아보게 될 거임. 어느새 걔네는 하나님 앞에 엎드려서 하나님이 너네 가운데 계시다는 걸 인정하게 될 거임.</w:t>
             </w:r>
           </w:p>
         </w:tc>
@@ -11685,7 +11685,7 @@
               <w:rPr>
                 <w:sz w:val="18"/>
               </w:rPr>
-              <w:t>디모데가 너네한테 가게 되면 진짜 잘해줘. 너네 사이에서 안심하고 지낼 수 있게 해주고. 걔도 나처럼 주님을 위해 열심히 일하는 애거든. 걔를 깔보는 사람이 없도록 해줘. 내가 걔를 기다리고 있다고 전해줘. 걔랑 같이 있던 형제들도 기다리고 있으니까.</w:t>
+              <w:t>디모데가 너네한테 가게 되면 진짜 잘해줘. 너네 사이에서 안심하고 지낼 수 있게 해주고. 걔도 나처럼 주님을 위해 열심히 일하는 애거든. 걔를 깔보는 사람이 없도록 해줘. 조금 있다가 걔를 나한테 보낼 땐 너네 축복을 가득 실어서 보내줘. 내가 걔랑 같이 오는 친구들도 기다리고 있다고 전해줘.</w:t>
             </w:r>
           </w:p>
         </w:tc>
@@ -11733,7 +11733,7 @@
               <w:rPr>
                 <w:sz w:val="18"/>
               </w:rPr>
-              <w:t>About our friend Apollos, I've done my best to get him to pay you a visit, but haven't talked him into it yet. He doesn't think this is the right time. But there will be a "right time.</w:t>
+              <w:t>About our friend Apollos, I've done my best to get him to pay you a visit, but haven't talked him into it yet. He doesn't think this is the right time. But there will be a "right time."</w:t>
             </w:r>
           </w:p>
         </w:tc>

</xml_diff>

<commit_message>
§ 소제목 행 배지 제거 렌더링 변경 (2026-09-23 성욱 지시): build_gdocs.py에서 소제목 행은 제목만 표시, 배지는 verseRanges 데이터에만 유지. 27권 전체 재빌드(VERIFY_DROPPED=0) + pairing verifier 27권 PASS + Google Docs 재업로드(API 테이블 수·export-back VERIFIED OK 27/27). 본문 텍스트 변경 없음. TRANSLATION_PRINCIPLES.md 원칙 2에 렌더링 노트 추가.
</commit_message>
<xml_diff>
--- a/gdocs_build/1Corinthians.docx
+++ b/gdocs_build/1Corinthians.docx
@@ -388,15 +388,6 @@
             <w:r>
               <w:rPr>
                 <w:b/>
-                <w:sz w:val="16"/>
-              </w:rPr>
-              <w:t>10</w:t>
-            </w:r>
-          </w:p>
-          <w:p>
-            <w:r>
-              <w:rPr>
-                <w:b/>
                 <w:sz w:val="18"/>
               </w:rPr>
               <w:t>The Cross: The Irony of God's Wisdom</w:t>
@@ -409,15 +400,6 @@
           </w:tcPr>
           <w:p>
             <w:r/>
-            <w:r>
-              <w:rPr>
-                <w:b/>
-                <w:sz w:val="16"/>
-              </w:rPr>
-              <w:t>10</w:t>
-            </w:r>
-          </w:p>
-          <w:p>
             <w:r>
               <w:rPr>
                 <w:b/>
@@ -2676,15 +2658,6 @@
             <w:r>
               <w:rPr>
                 <w:b/>
-                <w:sz w:val="16"/>
-              </w:rPr>
-              <w:t>1-2</w:t>
-            </w:r>
-          </w:p>
-          <w:p>
-            <w:r>
-              <w:rPr>
-                <w:b/>
                 <w:sz w:val="18"/>
               </w:rPr>
               <w:t>The Mystery of Sex</w:t>
@@ -2697,15 +2670,6 @@
           </w:tcPr>
           <w:p>
             <w:r/>
-            <w:r>
-              <w:rPr>
-                <w:b/>
-                <w:sz w:val="16"/>
-              </w:rPr>
-              <w:t>1-2</w:t>
-            </w:r>
-          </w:p>
-          <w:p>
             <w:r>
               <w:rPr>
                 <w:b/>
@@ -3725,15 +3689,6 @@
             <w:r>
               <w:rPr>
                 <w:b/>
-                <w:sz w:val="16"/>
-              </w:rPr>
-              <w:t>1</w:t>
-            </w:r>
-          </w:p>
-          <w:p>
-            <w:r>
-              <w:rPr>
-                <w:b/>
                 <w:sz w:val="18"/>
               </w:rPr>
               <w:t>To Be Married, to Be Single . . .</w:t>
@@ -3746,15 +3701,6 @@
           </w:tcPr>
           <w:p>
             <w:r/>
-            <w:r>
-              <w:rPr>
-                <w:b/>
-                <w:sz w:val="16"/>
-              </w:rPr>
-              <w:t>1</w:t>
-            </w:r>
-          </w:p>
-          <w:p>
             <w:r>
               <w:rPr>
                 <w:b/>
@@ -4991,15 +4937,6 @@
             <w:r>
               <w:rPr>
                 <w:b/>
-                <w:sz w:val="16"/>
-              </w:rPr>
-              <w:t>1-3</w:t>
-            </w:r>
-          </w:p>
-          <w:p>
-            <w:r>
-              <w:rPr>
-                <w:b/>
                 <w:sz w:val="18"/>
               </w:rPr>
               <w:t>Freedom with Responsibility</w:t>
@@ -5012,15 +4949,6 @@
           </w:tcPr>
           <w:p>
             <w:r/>
-            <w:r>
-              <w:rPr>
-                <w:b/>
-                <w:sz w:val="16"/>
-              </w:rPr>
-              <w:t>1-3</w:t>
-            </w:r>
-          </w:p>
-          <w:p>
             <w:r>
               <w:rPr>
                 <w:b/>
@@ -7038,15 +6966,6 @@
             <w:r>
               <w:rPr>
                 <w:b/>
-                <w:sz w:val="16"/>
-              </w:rPr>
-              <w:t>1-2</w:t>
-            </w:r>
-          </w:p>
-          <w:p>
-            <w:r>
-              <w:rPr>
-                <w:b/>
                 <w:sz w:val="18"/>
               </w:rPr>
               <w:t>To Honor God</w:t>
@@ -7059,15 +6978,6 @@
           </w:tcPr>
           <w:p>
             <w:r/>
-            <w:r>
-              <w:rPr>
-                <w:b/>
-                <w:sz w:val="16"/>
-              </w:rPr>
-              <w:t>1-2</w:t>
-            </w:r>
-          </w:p>
-          <w:p>
             <w:r>
               <w:rPr>
                 <w:b/>
@@ -7918,15 +7828,6 @@
             <w:r>
               <w:rPr>
                 <w:b/>
-                <w:sz w:val="16"/>
-              </w:rPr>
-              <w:t>1-3</w:t>
-            </w:r>
-          </w:p>
-          <w:p>
-            <w:r>
-              <w:rPr>
-                <w:b/>
                 <w:sz w:val="18"/>
               </w:rPr>
               <w:t>Spiritual Gifts</w:t>
@@ -7939,15 +7840,6 @@
           </w:tcPr>
           <w:p>
             <w:r/>
-            <w:r>
-              <w:rPr>
-                <w:b/>
-                <w:sz w:val="16"/>
-              </w:rPr>
-              <w:t>1-3</w:t>
-            </w:r>
-          </w:p>
-          <w:p>
             <w:r>
               <w:rPr>
                 <w:b/>
@@ -8593,15 +8485,6 @@
             <w:r>
               <w:rPr>
                 <w:b/>
-                <w:sz w:val="16"/>
-              </w:rPr>
-              <w:t>1</w:t>
-            </w:r>
-          </w:p>
-          <w:p>
-            <w:r>
-              <w:rPr>
-                <w:b/>
                 <w:sz w:val="18"/>
               </w:rPr>
               <w:t>The Way of Love</w:t>
@@ -8614,15 +8497,6 @@
           </w:tcPr>
           <w:p>
             <w:r/>
-            <w:r>
-              <w:rPr>
-                <w:b/>
-                <w:sz w:val="16"/>
-              </w:rPr>
-              <w:t>1</w:t>
-            </w:r>
-          </w:p>
-          <w:p>
             <w:r>
               <w:rPr>
                 <w:b/>
@@ -9228,15 +9102,6 @@
             <w:r>
               <w:rPr>
                 <w:b/>
-                <w:sz w:val="16"/>
-              </w:rPr>
-              <w:t>1-3</w:t>
-            </w:r>
-          </w:p>
-          <w:p>
-            <w:r>
-              <w:rPr>
-                <w:b/>
                 <w:sz w:val="18"/>
               </w:rPr>
               <w:t>Prayer Language</w:t>
@@ -9249,15 +9114,6 @@
           </w:tcPr>
           <w:p>
             <w:r/>
-            <w:r>
-              <w:rPr>
-                <w:b/>
-                <w:sz w:val="16"/>
-              </w:rPr>
-              <w:t>1-3</w:t>
-            </w:r>
-          </w:p>
-          <w:p>
             <w:r>
               <w:rPr>
                 <w:b/>
@@ -10155,15 +10011,6 @@
             <w:r>
               <w:rPr>
                 <w:b/>
-                <w:sz w:val="16"/>
-              </w:rPr>
-              <w:t>1-2</w:t>
-            </w:r>
-          </w:p>
-          <w:p>
-            <w:r>
-              <w:rPr>
-                <w:b/>
                 <w:sz w:val="18"/>
               </w:rPr>
               <w:t>Resurrection</w:t>
@@ -10176,15 +10023,6 @@
           </w:tcPr>
           <w:p>
             <w:r/>
-            <w:r>
-              <w:rPr>
-                <w:b/>
-                <w:sz w:val="16"/>
-              </w:rPr>
-              <w:t>1-2</w:t>
-            </w:r>
-          </w:p>
-          <w:p>
             <w:r>
               <w:rPr>
                 <w:b/>
@@ -11437,15 +11275,6 @@
             <w:r>
               <w:rPr>
                 <w:b/>
-                <w:sz w:val="16"/>
-              </w:rPr>
-              <w:t>1-4</w:t>
-            </w:r>
-          </w:p>
-          <w:p>
-            <w:r>
-              <w:rPr>
-                <w:b/>
                 <w:sz w:val="18"/>
               </w:rPr>
               <w:t>Coming to See You</w:t>
@@ -11458,15 +11287,6 @@
           </w:tcPr>
           <w:p>
             <w:r/>
-            <w:r>
-              <w:rPr>
-                <w:b/>
-                <w:sz w:val="16"/>
-              </w:rPr>
-              <w:t>1-4</w:t>
-            </w:r>
-          </w:p>
-          <w:p>
             <w:r>
               <w:rPr>
                 <w:b/>

</xml_diff>

<commit_message>
1Corinthians 3차 후속: EN our main man→our Master(ch1:3), KO 15:51-57·7:25-28·10:19-22 의미 정확도 수정
</commit_message>
<xml_diff>
--- a/gdocs_build/1Corinthians.docx
+++ b/gdocs_build/1Corinthians.docx
@@ -195,7 +195,7 @@
               <w:rPr>
                 <w:sz w:val="18"/>
               </w:rPr>
-              <w:t>Hope you guys get all the awesome perks and blessings from God our Father and our main man, Jesus Christ.</w:t>
+              <w:t>Hope you guys get all the awesome perks and blessings from God our Father and our Master, Jesus Christ.</w:t>
             </w:r>
           </w:p>
         </w:tc>
@@ -4558,7 +4558,7 @@
               <w:rPr>
                 <w:sz w:val="18"/>
               </w:rPr>
-              <w:t>주님이 처녀들에 대해서는 딱히 지침을 주신 건 없음. 근데 주님의 엄청난 자비를 경험하고, 계속 그분한테 충성해온 사람으로서 내가 하는 조언이니까 믿어도 됨. 지금 사방에서 우리를 압박하는 게 많으니까, 내 생각엔 그냥 지금 상태 그대로 사는 게 제일 좋은 것 같음. 결혼했음? 그럼 결혼한 채로 사셈. 미혼임? 그럼 미혼인 채로 사셈. 근데 너네가 처녀든 아니든 결혼하는 게 죄는 아님. 내가 말하고 싶은 건, 이미 힘든 일이 많은 이 시대에 결혼까지 하면 스트레스가 더 쌓일 거라는 거임. 가능하면 진짜 뜯어말리고 싶음.</w:t>
+              <w:t>주님이 처녀들에 대해서는 딱히 지침을 주신 건 없음. 근데 주님의 엄청난 자비를 경험하고, 계속 그분한테 충성해온 사람으로서 내가 하는 조언이니까 믿어도 됨. 지금 사방에서 우리를 압박하는 게 많으니까, 내 생각엔 그냥 지금 상태 그대로 사는 게 제일 좋은 것 같음. 결혼했음? 그럼 결혼한 채로 사셈. 미혼임? 그럼 미혼인 채로 사셈. 근데 너네가 처녀든 아니든 결혼하는 게 죄는 아님. 내가 말하고 싶은 건, 이미 힘든 일이 많은 이 시대에 결혼까지 하면 스트레스가 더 쌓일 거라는 거임. 가능하면 너네가 그 스트레스 안 받았으면 좋겠음.</w:t>
             </w:r>
           </w:p>
         </w:tc>
@@ -6587,7 +6587,7 @@
               <w:rPr>
                 <w:sz w:val="18"/>
               </w:rPr>
-              <w:t>이제 차이 알겠음? 우상한테 바친 제물은 아무것도 아닌 것에 바친 거야. 우상이 아무것도 아니니까. 근데 사실 우상은 아무것도 아닌 것보다 더 심각해. 마이너스, 바로 마귀거든. 제발 너희 스스로를 너희보다 못한 존재로 떨어뜨리지 마. 둘 다 가질 순 없어. 하루는 주님과 파티하고, 다음 날은 마귀랑 파티할 순 없다고. 주님은 그런 거 못 참으심. 주님은 우리 전부를 원하셔. 전부가 아니면 우린 아무것도 아니게 돼. 그런데도 너희는 너희보다 못한 거랑 어울릴래?</w:t>
+              <w:t>이제 차이 알겠음? 우상한테 바친 제물은 아무것도 아닌 것에 바친 거야. 우상이 아무것도 아니니까. 근데 사실 우상은 아무것도 아닌 것보다 더 심각해. 마이너스, 바로 마귀거든. 제발 너희 스스로를 너희보다 못한 존재로 떨어뜨리지 마. 둘 다 가질 순 없어. 하루는 주님과 파티하고, 다음 날은 마귀랑 파티할 순 없다고. 주님은 그런 거 못 참으심. 주님은 우리를 통째로 원하셔. 전부 아니면 아무것도 아니야. 설마 너희가 그거보다 덜한 걸로 대충 넘어갈 수 있다고 생각해?</w:t>
             </w:r>
           </w:p>
         </w:tc>
@@ -11109,7 +11109,7 @@
               <w:rPr>
                 <w:sz w:val="18"/>
               </w:rPr>
-              <w:t>근데 내가 너희한테 나도 다 이해 못 하는 놀라운 비밀을 알려줄게. 우린 모두 죽지 않고 변화될 거야. 모든 소리를 잠재울 나팔 소리를 듣고 위를 쳐다보며 눈을 깜빡이는 순간, 그 일은 끝날 거야. 나팔 신호가 하늘에서 울리면, 죽은 사람들이 무덤을 박차고 일어나서 죽음의 힘이 닿지 않는 곳, 다시는 죽을 일이 없는 곳에 이르게 될 거야. 동시에 우리도 그들과 똑같이 변화될 거라고. 부활 계획표에는 이런 일이 일어나게 되어 있어. 모든 썩을 것이 썩지 않을 것으로 바뀌고, 죽을 수밖에 없는 것이 죽지 않을 것으로 바뀔 거야. 그때가 되면 이런 말씀이 이루어질 거야. '생명이 죽음을 삼키고 승리를 거두었다!' 오 죽음아, 이제 누가 마지막 말을 하냐? 오 죽음아, 이제 누가 널 무서워하겠냐? 죄가 죽음을 만들었고, 율법의 죄책감이 죄에게 힘과 파괴력을 줬어. 하지만 생명이신 분의 한 방으로 그 세 가지-죄, 죄책감, 죽음-가 모두 사라지게 된 거야. 이 모든 게 우리 주 예수 그리스도의 선물임. 그러니 하나님께 감사드리자!</w:t>
+              <w:t>근데 내가 너희한테 나도 다 이해 못 하는 놀라운 비밀을 알려줄게. 우리 모두가 죽는 건 아니지만, 모두 변화될 거야. 모든 소리를 잠재울 나팔 소리를 듣고 위를 쳐다보며 눈을 깜빡이는 순간, 그 일은 끝날 거야. 나팔 신호가 하늘에서 울리면, 죽은 사람들이 무덤을 박차고 일어나서 죽음의 힘이 닿지 않는 곳, 다시는 죽을 일이 없는 곳에 이르게 될 거야. 동시에 우리도 그들과 똑같이 변화될 거라고. 부활 계획표에는 이런 일이 일어나게 되어 있어. 모든 썩을 것이 썩지 않을 것으로 바뀌고, 죽을 수밖에 없는 것이 죽지 않을 것으로 바뀔 거야. 그때가 되면 이런 말씀이 이루어질 거야. '생명이 죽음을 삼키고 승리를 거두었다!' 오 죽음아, 이제 누가 마지막 말을 하냐? 오 죽음아, 이제 누가 널 무서워하겠냐? 죄가 죽음을 만들었고, 율법의 죄책감이 죄에게 힘과 파괴력을 줬어. 하지만 생명이신 분의 한 방으로 그 세 가지-죄, 죄책감, 죽음-가 모두 사라지게 된 거야. 이 모든 게 우리 주 예수 그리스도의 선물임. 그러니 하나님께 감사드리자!</w:t>
             </w:r>
           </w:p>
         </w:tc>

</xml_diff>